<commit_message>
Add industry hull-as-speaker teardown with sources and diagrams
Standalone comparison of Dreampod, i-sopod, Ocean Float Rooms, Float Tank
Solutions, and Clark Synthesis: official wording, physics, estimated
construction where vendors do not publish it, and install steps. Separate
from our dual-path product spec.

Co-authored-by: happyandloveandforever <happyandloveandforever@users.noreply.github.com>
</commit_message>
<xml_diff>
--- a/docs/漂浮方舟_舱内壳体传声_产品开发方案.docx
+++ b/docs/漂浮方舟_舱内壳体传声_产品开发方案.docx
@@ -292,6 +292,32 @@
           <w:b w:val="0"/>
         </w:rPr>
         <w:t>对外不讲疗效。专利文件里不写激活迷走。</w:t>
+      </w:r>
+    </w:p>
+    <w:p>
+      <w:pPr>
+        <w:jc w:val="left"/>
+      </w:pPr>
+      <w:r>
+        <w:rPr>
+          <w:rFonts w:ascii="微软雅黑" w:hAnsi="微软雅黑" w:eastAsia="微软雅黑"/>
+          <w:b w:val="0"/>
+        </w:rPr>
+        <w:t>行业把舱壁当喇叭的公开做法（Dreampod / i-sopod / Ocean / Clark 等）已拆成单独一份，带官网链接、原理和图：</w:t>
+      </w:r>
+      <w:r>
+        <w:rPr>
+          <w:rFonts w:ascii="微软雅黑" w:hAnsi="微软雅黑" w:eastAsia="微软雅黑"/>
+          <w:color w:val="B03060"/>
+        </w:rPr>
+        <w:t>docs/行业壳体传声-公开做法拆解.md</w:t>
+      </w:r>
+      <w:r>
+        <w:rPr>
+          <w:rFonts w:ascii="微软雅黑" w:hAnsi="微软雅黑" w:eastAsia="微软雅黑"/>
+          <w:b w:val="0"/>
+        </w:rPr>
+        <w:t>。那是零件和安装的对照，不是我们的产品定义。</w:t>
       </w:r>
     </w:p>
     <w:p/>

</xml_diff>